<commit_message>
v0.8.0: teammate web + native Android UIs on the shared engine; green/gold brand; drop hardcoded demo data
- Add ui/web-app (React + Vite, teammate UI) wired to engine/src; all hardcoded/demo data removed
- Add ui/android (Kotlin + Jetpack Compose, teammate UI)
- Brand logo (green #2D5D4F + gold #FACB43) across icons, launchers, splashes, in-app marks
- Unify version to 0.8.0 everywhere; trim web-app deps (installs without --legacy-peer-deps)
- Add root README, CHANGELOG, CREDITS; update docs sources + regenerate Word docs
</commit_message>
<xml_diff>
--- a/docs/Vector-README.docx
+++ b/docs/Vector-README.docx
@@ -1938,6 +1938,208 @@
           <w:color w:val="333333"/>
         </w:rPr>
         <w:t xml:space="preserve">tools/                icon generator, packaging script</w:t>
+      </w:r>
+    </w:p>
+    <w:p>
+      <w:pPr>
+        <w:spacing w:before="0" w:after="60"/>
+      </w:pPr>
+    </w:p>
+    <w:p>
+      <w:pPr>
+        <w:spacing w:before="260" w:after="120"/>
+      </w:pPr>
+      <w:r>
+        <w:rPr>
+          <w:b/>
+          <w:sz w:val="30"/>
+          <w:szCs w:val="30"/>
+          <w:color w:val="1F3864"/>
+        </w:rPr>
+        <w:t xml:space="preserve">Clients (v0.8.0)</w:t>
+      </w:r>
+    </w:p>
+    <w:p>
+      <w:pPr>
+        <w:spacing w:before="0" w:after="60"/>
+      </w:pPr>
+    </w:p>
+    <w:p>
+      <w:pPr>
+        <w:spacing w:before="0" w:after="100"/>
+      </w:pPr>
+      <w:r>
+        <w:rPr>
+          <w:sz w:val="22"/>
+          <w:szCs w:val="22"/>
+        </w:rPr>
+        <w:t xml:space="preserve">Every client calls the same engine, so they all return identical results:</w:t>
+      </w:r>
+    </w:p>
+    <w:p>
+      <w:pPr>
+        <w:spacing w:before="0" w:after="60"/>
+      </w:pPr>
+    </w:p>
+    <w:p>
+      <w:pPr>
+        <w:spacing w:before="0" w:after="0"/>
+      </w:pPr>
+      <w:r>
+        <w:rPr>
+          <w:rFonts w:ascii="Consolas" w:hAnsi="Consolas"/>
+          <w:sz w:val="18"/>
+          <w:szCs w:val="18"/>
+        </w:rPr>
+        <w:t xml:space="preserve">Client   |   Path   |   Stack</w:t>
+      </w:r>
+    </w:p>
+    <w:p>
+      <w:pPr>
+        <w:spacing w:before="0" w:after="0"/>
+      </w:pPr>
+      <w:r>
+        <w:rPr>
+          <w:rFonts w:ascii="Consolas" w:hAnsi="Consolas"/>
+          <w:sz w:val="18"/>
+          <w:szCs w:val="18"/>
+        </w:rPr>
+        <w:t xml:space="preserve">Chrome/Edge extension   |   ui/extension/   |   Manifest V3 (popup, in-page panel, options)</w:t>
+      </w:r>
+    </w:p>
+    <w:p>
+      <w:pPr>
+        <w:spacing w:before="0" w:after="0"/>
+      </w:pPr>
+      <w:r>
+        <w:rPr>
+          <w:rFonts w:ascii="Consolas" w:hAnsi="Consolas"/>
+          <w:sz w:val="18"/>
+          <w:szCs w:val="18"/>
+        </w:rPr>
+        <w:t xml:space="preserve">Web demo   |   ui/web/   |   static HTML/JS (GitHub Pages)</w:t>
+      </w:r>
+    </w:p>
+    <w:p>
+      <w:pPr>
+        <w:spacing w:before="0" w:after="0"/>
+      </w:pPr>
+      <w:r>
+        <w:rPr>
+          <w:rFonts w:ascii="Consolas" w:hAnsi="Consolas"/>
+          <w:sz w:val="18"/>
+          <w:szCs w:val="18"/>
+        </w:rPr>
+        <w:t xml:space="preserve">Web app   |   ui/web-app/   |   React + Vite + Tailwind (npm run webapp:install, then npm run webapp)</w:t>
+      </w:r>
+    </w:p>
+    <w:p>
+      <w:pPr>
+        <w:spacing w:before="0" w:after="0"/>
+      </w:pPr>
+      <w:r>
+        <w:rPr>
+          <w:rFonts w:ascii="Consolas" w:hAnsi="Consolas"/>
+          <w:sz w:val="18"/>
+          <w:szCs w:val="18"/>
+        </w:rPr>
+        <w:t xml:space="preserve">Mobile (iOS + Android)   |   ui/mobile-expo/   |   React Native / Expo</w:t>
+      </w:r>
+    </w:p>
+    <w:p>
+      <w:pPr>
+        <w:spacing w:before="0" w:after="0"/>
+      </w:pPr>
+      <w:r>
+        <w:rPr>
+          <w:rFonts w:ascii="Consolas" w:hAnsi="Consolas"/>
+          <w:sz w:val="18"/>
+          <w:szCs w:val="18"/>
+        </w:rPr>
+        <w:t xml:space="preserve">Mobile (Android)   |   ui/mobile-native/   |   Capacitor (wraps the web client)</w:t>
+      </w:r>
+    </w:p>
+    <w:p>
+      <w:pPr>
+        <w:spacing w:before="0" w:after="0"/>
+      </w:pPr>
+      <w:r>
+        <w:rPr>
+          <w:rFonts w:ascii="Consolas" w:hAnsi="Consolas"/>
+          <w:sz w:val="18"/>
+          <w:szCs w:val="18"/>
+        </w:rPr>
+        <w:t xml:space="preserve">Native Android   |   ui/android/   |   Kotlin + Jetpack Compose</w:t>
+      </w:r>
+    </w:p>
+    <w:p>
+      <w:pPr>
+        <w:spacing w:before="0" w:after="60"/>
+      </w:pPr>
+    </w:p>
+    <w:p>
+      <w:pPr>
+        <w:spacing w:before="0" w:after="100"/>
+      </w:pPr>
+      <w:r>
+        <w:rPr>
+          <w:sz w:val="22"/>
+          <w:szCs w:val="22"/>
+        </w:rPr>
+        <w:t xml:space="preserve">Brand: the logo is a dark-green tile (#2D5D4F) with a gold V (#FACB43),</w:t>
+      </w:r>
+    </w:p>
+    <w:p>
+      <w:pPr>
+        <w:spacing w:before="0" w:after="100"/>
+      </w:pPr>
+      <w:r>
+        <w:rPr>
+          <w:sz w:val="22"/>
+          <w:szCs w:val="22"/>
+        </w:rPr>
+        <w:t xml:space="preserve">generated for every surface by tools/make-icons.js (npm run icons).</w:t>
+      </w:r>
+    </w:p>
+    <w:p>
+      <w:pPr>
+        <w:spacing w:before="0" w:after="60"/>
+      </w:pPr>
+    </w:p>
+    <w:p>
+      <w:pPr>
+        <w:spacing w:before="0" w:after="100"/>
+      </w:pPr>
+      <w:r>
+        <w:rPr>
+          <w:sz w:val="22"/>
+          <w:szCs w:val="22"/>
+        </w:rPr>
+        <w:t xml:space="preserve">Credits: the React web client (ui/web-app) and the native Android client</w:t>
+      </w:r>
+    </w:p>
+    <w:p>
+      <w:pPr>
+        <w:spacing w:before="0" w:after="100"/>
+      </w:pPr>
+      <w:r>
+        <w:rPr>
+          <w:sz w:val="22"/>
+          <w:szCs w:val="22"/>
+        </w:rPr>
+        <w:t xml:space="preserve">(ui/android) are UI contributions from teammate Satya Sree Pada; see</w:t>
+      </w:r>
+    </w:p>
+    <w:p>
+      <w:pPr>
+        <w:spacing w:before="0" w:after="100"/>
+      </w:pPr>
+      <w:r>
+        <w:rPr>
+          <w:sz w:val="22"/>
+          <w:szCs w:val="22"/>
+        </w:rPr>
+        <w:t xml:space="preserve">CREDITS.md.</w:t>
       </w:r>
     </w:p>
     <w:p>

</xml_diff>